<commit_message>
Implement multiple Python programs including a grade conversion tool, an interactive multi-function program, and various utility scripts for date, math, OS operations, random number generation, and system information. Each program includes user input handling, validation, and output formatting.
</commit_message>
<xml_diff>
--- a/Tugas Pertemuan 3.docx
+++ b/Tugas Pertemuan 3.docx
@@ -3183,6 +3183,100 @@
           <w:lang w:val="en-ID"/>
         </w:rPr>
       </w:pPr>
+    </w:p>
+    <w:p>
+      <w:pPr>
+        <w:rPr>
+          <w:rFonts w:ascii="Times New Roman" w:hAnsi="Times New Roman" w:cs="Times New Roman"/>
+          <w:b/>
+          <w:bCs/>
+          <w:sz w:val="32"/>
+          <w:szCs w:val="32"/>
+          <w:lang w:val="en-ID"/>
+        </w:rPr>
+      </w:pPr>
+    </w:p>
+    <w:p>
+      <w:pPr>
+        <w:rPr>
+          <w:rFonts w:ascii="Times New Roman" w:hAnsi="Times New Roman" w:cs="Times New Roman"/>
+          <w:b/>
+          <w:bCs/>
+          <w:sz w:val="32"/>
+          <w:szCs w:val="32"/>
+          <w:lang w:val="en-ID"/>
+        </w:rPr>
+      </w:pPr>
+    </w:p>
+    <w:p>
+      <w:pPr>
+        <w:rPr>
+          <w:rFonts w:ascii="Times New Roman" w:hAnsi="Times New Roman" w:cs="Times New Roman"/>
+          <w:b/>
+          <w:bCs/>
+          <w:sz w:val="32"/>
+          <w:szCs w:val="32"/>
+          <w:lang w:val="en-ID"/>
+        </w:rPr>
+      </w:pPr>
+    </w:p>
+    <w:p>
+      <w:pPr>
+        <w:rPr>
+          <w:rFonts w:ascii="Times New Roman" w:hAnsi="Times New Roman" w:cs="Times New Roman"/>
+          <w:b/>
+          <w:bCs/>
+          <w:sz w:val="32"/>
+          <w:szCs w:val="32"/>
+          <w:lang w:val="en-ID"/>
+        </w:rPr>
+      </w:pPr>
+    </w:p>
+    <w:p>
+      <w:pPr>
+        <w:rPr>
+          <w:rFonts w:ascii="Times New Roman" w:hAnsi="Times New Roman" w:cs="Times New Roman"/>
+          <w:b/>
+          <w:bCs/>
+          <w:sz w:val="32"/>
+          <w:szCs w:val="32"/>
+          <w:lang w:val="en-ID"/>
+        </w:rPr>
+      </w:pPr>
+      <w:r>
+        <w:rPr>
+          <w:rFonts w:ascii="Times New Roman" w:hAnsi="Times New Roman" w:cs="Times New Roman"/>
+          <w:b/>
+          <w:bCs/>
+          <w:sz w:val="32"/>
+          <w:szCs w:val="32"/>
+          <w:lang w:val="en-ID"/>
+        </w:rPr>
+        <w:t>File Python :</w:t>
+      </w:r>
+    </w:p>
+    <w:p>
+      <w:pPr>
+        <w:rPr>
+          <w:rFonts w:ascii="Times New Roman" w:hAnsi="Times New Roman" w:cs="Times New Roman"/>
+          <w:b/>
+          <w:bCs/>
+          <w:sz w:val="32"/>
+          <w:szCs w:val="32"/>
+          <w:lang w:val="en-ID"/>
+        </w:rPr>
+      </w:pPr>
+      <w:r>
+        <w:rPr>
+          <w:rFonts w:ascii="Times New Roman" w:hAnsi="Times New Roman" w:cs="Times New Roman"/>
+          <w:b/>
+          <w:bCs/>
+          <w:sz w:val="32"/>
+          <w:szCs w:val="32"/>
+          <w:lang w:val="en-ID"/>
+        </w:rPr>
+        <w:t>https://github.com/Denmasmolano21/tugas_semester_1</w:t>
+      </w:r>
     </w:p>
     <w:sectPr>
       <w:pgSz w:w="11906" w:h="16838"/>
@@ -5315,28 +5409,28 @@
 </file>
 
 <file path=customXml/item1.xml><?xml version="1.0" encoding="utf-8"?>
-<b:Sources xmlns:b="http://schemas.openxmlformats.org/officeDocument/2006/bibliography" xmlns="http://schemas.openxmlformats.org/officeDocument/2006/bibliography" SelectedStyle="\APASixthEditionOfficeOnline.xsl" StyleName="APA" Version="6"/>
-</file>
-
-<file path=customXml/item2.xml><?xml version="1.0" encoding="utf-8"?>
 <go:gDocsCustomXmlDataStorage xmlns:go="http://customooxmlschemas.google.com/" xmlns:r="http://schemas.openxmlformats.org/officeDocument/2006/relationships" uri="GoogleDocsCustomDataVersion2">
   <go:docsCustomData xmlns:go="http://customooxmlschemas.google.com/" roundtripDataSignature="AMtx7mgC3nhaX4bzQEhDc8+uNRDKGfSkbA==">CgMxLjA4AHIhMTZYdFhSNFVzRTExZUZ0bzJZWjBJM25XMUVTbkpwSWph</go:docsCustomData>
 </go:gDocsCustomXmlDataStorage>
 </file>
 
-<file path=customXml/itemProps1.xml><?xml version="1.0" encoding="utf-8"?>
-<ds:datastoreItem xmlns:ds="http://schemas.openxmlformats.org/officeDocument/2006/customXml" ds:itemID="{CBCB603C-C0F5-4307-94D3-408752509402}">
-  <ds:schemaRefs>
-    <ds:schemaRef ds:uri="http://schemas.openxmlformats.org/officeDocument/2006/bibliography"/>
-  </ds:schemaRefs>
-</ds:datastoreItem>
+<file path=customXml/item2.xml><?xml version="1.0" encoding="utf-8"?>
+<b:Sources xmlns:b="http://schemas.openxmlformats.org/officeDocument/2006/bibliography" xmlns="http://schemas.openxmlformats.org/officeDocument/2006/bibliography" SelectedStyle="\APASixthEditionOfficeOnline.xsl" StyleName="APA" Version="6"/>
 </file>
 
-<file path=customXml/itemProps2.xml><?xml version="1.0" encoding="utf-8"?>
+<file path=customXml/itemProps1.xml><?xml version="1.0" encoding="utf-8"?>
 <ds:datastoreItem xmlns:ds="http://schemas.openxmlformats.org/officeDocument/2006/customXml" ds:itemID="{11111111-1234-1234-1234-123412341234}">
   <ds:schemaRefs>
     <ds:schemaRef ds:uri="http://customooxmlschemas.google.com/"/>
     <ds:schemaRef ds:uri="http://schemas.openxmlformats.org/officeDocument/2006/relationships"/>
   </ds:schemaRefs>
 </ds:datastoreItem>
+</file>
+
+<file path=customXml/itemProps2.xml><?xml version="1.0" encoding="utf-8"?>
+<ds:datastoreItem xmlns:ds="http://schemas.openxmlformats.org/officeDocument/2006/customXml" ds:itemID="{CBCB603C-C0F5-4307-94D3-408752509402}">
+  <ds:schemaRefs>
+    <ds:schemaRef ds:uri="http://schemas.openxmlformats.org/officeDocument/2006/bibliography"/>
+  </ds:schemaRefs>
+</ds:datastoreItem>
 </file>
</xml_diff>